<commit_message>
campanha: ajustes nas mensagens da Black Expert
Co-Authored-By: Claude Opus 5.5 <noreply@anthropic.com>
</commit_message>
<xml_diff>
--- a/business/campanhas/black-friday-grupo-2026/mensagens-black-expert.docx
+++ b/business/campanhas/black-friday-grupo-2026/mensagens-black-expert.docx
@@ -39,15 +39,7 @@
         </w:rPr>
       </w:pPr>
       <w:r>
-        <w:t xml:space="preserve">Mensagem fixada do </w:t>
-      </w:r>
-      <w:proofErr w:type="spellStart"/>
-      <w:r>
-        <w:t>grupo</w:t>
-      </w:r>
-      <w:proofErr w:type="spellEnd"/>
-      <w:r>
-        <w:t xml:space="preserve"> da Black Expert</w:t>
+        <w:t>Mensagem fixada do grupo da Black Expert</w:t>
       </w:r>
       <w:r>
         <w:t xml:space="preserve"> - </w:t>
@@ -66,43 +58,7 @@
           <w:color w:val="666666"/>
           <w:sz w:val="19"/>
         </w:rPr>
-        <w:t xml:space="preserve">Fixar no topo </w:t>
-      </w:r>
-      <w:proofErr w:type="gramStart"/>
-      <w:r>
-        <w:rPr>
-          <w:i/>
-          <w:color w:val="666666"/>
-          <w:sz w:val="19"/>
-        </w:rPr>
-        <w:t>do</w:t>
-      </w:r>
-      <w:proofErr w:type="gramEnd"/>
-      <w:r>
-        <w:rPr>
-          <w:i/>
-          <w:color w:val="666666"/>
-          <w:sz w:val="19"/>
-        </w:rPr>
-        <w:t xml:space="preserve"> grupo assim que ele estiver aberto (se ainda </w:t>
-      </w:r>
-      <w:proofErr w:type="gramStart"/>
-      <w:r>
-        <w:rPr>
-          <w:i/>
-          <w:color w:val="666666"/>
-          <w:sz w:val="19"/>
-        </w:rPr>
-        <w:t>não</w:t>
-      </w:r>
-      <w:proofErr w:type="gramEnd"/>
-      <w:r>
-        <w:rPr>
-          <w:i/>
-          <w:color w:val="666666"/>
-          <w:sz w:val="19"/>
-        </w:rPr>
-        <w:t xml:space="preserve"> estiver fixada).</w:t>
+        <w:t>Fixar no topo do grupo assim que ele estiver aberto (se ainda não estiver fixada).</w:t>
       </w:r>
     </w:p>
     <w:p>
@@ -292,21 +248,8 @@
       </w:pPr>
       <w:r>
         <w:lastRenderedPageBreak/>
-        <w:t xml:space="preserve">Live 32 — aviso de </w:t>
-      </w:r>
-      <w:proofErr w:type="spellStart"/>
-      <w:r>
-        <w:t>mudança</w:t>
-      </w:r>
-      <w:proofErr w:type="spellEnd"/>
-      <w:r>
-        <w:t xml:space="preserve"> de </w:t>
-      </w:r>
-      <w:proofErr w:type="spellStart"/>
-      <w:r>
-        <w:t>dia</w:t>
-      </w:r>
-      <w:proofErr w:type="spellEnd"/>
+        <w:t>Live 32 — aviso de mudança de dia</w:t>
+      </w:r>
       <w:r>
         <w:t xml:space="preserve"> - </w:t>
       </w:r>
@@ -335,18 +278,43 @@
     <w:p>
       <w:pPr>
         <w:pStyle w:val="Ttulo3"/>
+        <w:rPr>
+          <w:lang w:val="pt-BR"/>
+        </w:rPr>
       </w:pPr>
       <w:r>
         <w:t>Grupo das lives</w:t>
       </w:r>
-    </w:p>
-    <w:p>
-      <w:pPr>
-        <w:spacing w:after="0"/>
-        <w:ind w:left="227"/>
-      </w:pPr>
-      <w:r>
-        <w:t>Pessoal, aviso importante 📢</w:t>
+      <w:r>
+        <w:t xml:space="preserve"> </w:t>
+      </w:r>
+      <w:r>
+        <w:rPr>
+          <w:highlight w:val="yellow"/>
+        </w:rPr>
+        <w:t>OK</w:t>
+      </w:r>
+    </w:p>
+    <w:p>
+      <w:pPr>
+        <w:spacing w:after="0"/>
+        <w:ind w:left="227"/>
+      </w:pPr>
+      <w:proofErr w:type="spellStart"/>
+      <w:r>
+        <w:t>Pessoal</w:t>
+      </w:r>
+      <w:proofErr w:type="spellEnd"/>
+      <w:r>
+        <w:t xml:space="preserve">, aviso </w:t>
+      </w:r>
+      <w:proofErr w:type="spellStart"/>
+      <w:r>
+        <w:t>importante</w:t>
+      </w:r>
+      <w:proofErr w:type="spellEnd"/>
+      <w:r>
+        <w:t xml:space="preserve"> 📢</w:t>
       </w:r>
     </w:p>
     <w:p>
@@ -477,26 +445,41 @@
       <w:r>
         <w:t>WhatsApp individual</w:t>
       </w:r>
-    </w:p>
-    <w:p>
-      <w:pPr>
-        <w:spacing w:after="0"/>
-        <w:ind w:left="227"/>
-      </w:pPr>
-      <w:r>
-        <w:t>Oi {nome}, tudo bem?</w:t>
-      </w:r>
-    </w:p>
-    <w:p>
-      <w:pPr>
-        <w:spacing w:after="0"/>
-        <w:ind w:left="227"/>
-      </w:pPr>
-    </w:p>
-    <w:p>
-      <w:pPr>
-        <w:spacing w:after="0"/>
-        <w:ind w:left="227"/>
+      <w:r>
+        <w:t xml:space="preserve"> </w:t>
+      </w:r>
+      <w:proofErr w:type="spellStart"/>
+      <w:r>
+        <w:rPr>
+          <w:highlight w:val="yellow"/>
+        </w:rPr>
+        <w:t>Enviandoo</w:t>
+      </w:r>
+      <w:proofErr w:type="spellEnd"/>
+    </w:p>
+    <w:p>
+      <w:pPr>
+        <w:spacing w:after="0"/>
+      </w:pPr>
+      <w:r>
+        <w:t>O</w:t>
+      </w:r>
+      <w:r>
+        <w:t>lá</w:t>
+      </w:r>
+      <w:r>
+        <w:t>, tudo bem?</w:t>
+      </w:r>
+    </w:p>
+    <w:p>
+      <w:pPr>
+        <w:spacing w:after="0"/>
+        <w:ind w:left="227"/>
+      </w:pPr>
+    </w:p>
+    <w:p>
+      <w:pPr>
+        <w:spacing w:after="0"/>
       </w:pPr>
       <w:r>
         <w:t xml:space="preserve">Vim avisar antes de qualquer post: </w:t>
@@ -508,21 +491,24 @@
         </w:rPr>
         <w:t>dia 14 de outubro é a Black Expert</w:t>
       </w:r>
-    </w:p>
-    <w:p>
-      <w:pPr>
-        <w:spacing w:after="0"/>
-        <w:ind w:left="227"/>
-      </w:pPr>
-      <w:r>
-        <w:t>— e vou abrir uma condição da Mentoria em Grupo que não vou repetir</w:t>
-      </w:r>
-    </w:p>
-    <w:p>
-      <w:pPr>
-        <w:spacing w:after="0"/>
-        <w:ind w:left="227"/>
-      </w:pPr>
+      <w:r>
+        <w:t xml:space="preserve"> e </w:t>
+      </w:r>
+      <w:r>
+        <w:t xml:space="preserve">eu </w:t>
+      </w:r>
+      <w:r>
+        <w:t>vou abrir uma condição da</w:t>
+      </w:r>
+      <w:r>
+        <w:t xml:space="preserve"> </w:t>
+      </w:r>
+      <w:r>
+        <w:t>Mentoria em Grupo que não vou repetir</w:t>
+      </w:r>
+      <w:r>
+        <w:t xml:space="preserve"> </w:t>
+      </w:r>
       <w:r>
         <w:t>depois.</w:t>
       </w:r>
@@ -536,7 +522,6 @@
     <w:p>
       <w:pPr>
         <w:spacing w:after="0"/>
-        <w:ind w:left="227"/>
       </w:pPr>
       <w:r>
         <w:t>Criei um grupo só pra isso — é lá que eu conto os detalhes primeiro.</w:t>
@@ -551,49 +536,16 @@
     <w:p>
       <w:pPr>
         <w:spacing w:after="0"/>
-        <w:ind w:left="227"/>
-      </w:pPr>
-      <w:r>
-        <w:t xml:space="preserve">Entra </w:t>
-      </w:r>
-      <w:proofErr w:type="spellStart"/>
-      <w:r>
-        <w:t>aqui</w:t>
-      </w:r>
-      <w:proofErr w:type="spellEnd"/>
-      <w:r>
-        <w:t xml:space="preserve">: </w:t>
+      </w:pPr>
+      <w:r>
+        <w:t xml:space="preserve">Entra aqui: </w:t>
       </w:r>
       <w:hyperlink r:id="rId6" w:history="1">
         <w:r>
           <w:rPr>
             <w:rStyle w:val="Hyperlink"/>
           </w:rPr>
-          <w:t>{</w:t>
-        </w:r>
-        <w:r>
-          <w:rPr>
-            <w:rStyle w:val="Hyperlink"/>
-          </w:rPr>
-          <w:t>link G</w:t>
-        </w:r>
-        <w:r>
-          <w:rPr>
-            <w:rStyle w:val="Hyperlink"/>
-          </w:rPr>
-          <w:t>r</w:t>
-        </w:r>
-        <w:r>
-          <w:rPr>
-            <w:rStyle w:val="Hyperlink"/>
-          </w:rPr>
-          <w:t>upo</w:t>
-        </w:r>
-        <w:r>
-          <w:rPr>
-            <w:rStyle w:val="Hyperlink"/>
-          </w:rPr>
-          <w:t>}</w:t>
+          <w:t>https://chat.whatsapp.com/D150ioiZPgfGuYgsSNIwBH</w:t>
         </w:r>
       </w:hyperlink>
     </w:p>
@@ -602,14 +554,16 @@
         <w:spacing w:after="0"/>
         <w:ind w:left="227"/>
       </w:pPr>
-    </w:p>
-    <w:p>
-      <w:pPr>
-        <w:spacing w:after="0"/>
-        <w:ind w:left="227"/>
-      </w:pPr>
-      <w:r>
-        <w:t>— Karol</w:t>
+      <w:r>
+        <w:t xml:space="preserve"> </w:t>
+      </w:r>
+    </w:p>
+    <w:p>
+      <w:pPr>
+        <w:spacing w:after="0"/>
+      </w:pPr>
+      <w:r>
+        <w:t xml:space="preserve"> Karol</w:t>
       </w:r>
       <w:r>
         <w:t xml:space="preserve"> Senna</w:t>
@@ -622,6 +576,15 @@
       </w:pPr>
       <w:r>
         <w:t>E-mail</w:t>
+      </w:r>
+      <w:r>
+        <w:t xml:space="preserve"> </w:t>
+      </w:r>
+      <w:r>
+        <w:rPr>
+          <w:highlight w:val="yellow"/>
+        </w:rPr>
+        <w:t>OK</w:t>
       </w:r>
     </w:p>
     <w:p>
@@ -650,7 +613,6 @@
           <w:b/>
           <w:color w:val="E86A10"/>
         </w:rPr>
-        <w:lastRenderedPageBreak/>
         <w:t xml:space="preserve">Pré-cabeçalho: </w:t>
       </w:r>
       <w:r>
@@ -777,21 +739,7 @@
           <w:rPr>
             <w:rStyle w:val="Hyperlink"/>
           </w:rPr>
-          <w:t>{</w:t>
-        </w:r>
-        <w:proofErr w:type="spellStart"/>
-        <w:r>
-          <w:rPr>
-            <w:rStyle w:val="Hyperlink"/>
-          </w:rPr>
-          <w:t>link_grupo</w:t>
-        </w:r>
-        <w:proofErr w:type="spellEnd"/>
-        <w:r>
-          <w:rPr>
-            <w:rStyle w:val="Hyperlink"/>
-          </w:rPr>
-          <w:t>}</w:t>
+          <w:t>{link_grupo}</w:t>
         </w:r>
       </w:hyperlink>
     </w:p>
@@ -839,48 +787,14 @@
         <w:spacing w:after="0"/>
         <w:ind w:left="227"/>
       </w:pPr>
-      <w:proofErr w:type="gramStart"/>
-      <w:r>
-        <w:t>P.S.</w:t>
-      </w:r>
-      <w:proofErr w:type="gramEnd"/>
-      <w:r>
-        <w:t xml:space="preserve">: Se você já pensou em entrar na Mentoria em Grupo </w:t>
-      </w:r>
-      <w:proofErr w:type="spellStart"/>
-      <w:r>
-        <w:t>algum</w:t>
-      </w:r>
-      <w:proofErr w:type="spellEnd"/>
+      <w:r>
+        <w:t>P.S.: Se você já pensou em entrar na Mentoria em Grupo algum dia, vale</w:t>
+      </w:r>
       <w:r>
         <w:t xml:space="preserve"> </w:t>
       </w:r>
-      <w:proofErr w:type="spellStart"/>
-      <w:r>
-        <w:t>dia</w:t>
-      </w:r>
-      <w:proofErr w:type="spellEnd"/>
-      <w:r>
-        <w:t>, vale</w:t>
-      </w:r>
-      <w:r>
-        <w:t xml:space="preserve"> </w:t>
-      </w:r>
-      <w:proofErr w:type="spellStart"/>
-      <w:r>
-        <w:t>esperar</w:t>
-      </w:r>
-      <w:proofErr w:type="spellEnd"/>
-      <w:r>
-        <w:t xml:space="preserve"> </w:t>
-      </w:r>
-      <w:proofErr w:type="spellStart"/>
-      <w:r>
-        <w:t>até</w:t>
-      </w:r>
-      <w:proofErr w:type="spellEnd"/>
-      <w:r>
-        <w:t xml:space="preserve"> a Black Expert antes de decidir qualquer coisa.</w:t>
+      <w:r>
+        <w:t>esperar até a Black Expert antes de decidir qualquer coisa.</w:t>
       </w:r>
     </w:p>
     <w:p/>
@@ -936,16 +850,41 @@
         <w:pStyle w:val="Ttulo3"/>
       </w:pPr>
       <w:r>
-        <w:t>Manhã — grupo das lives</w:t>
-      </w:r>
-    </w:p>
-    <w:p>
-      <w:pPr>
-        <w:spacing w:after="0"/>
-        <w:ind w:left="227"/>
-      </w:pPr>
-      <w:r>
-        <w:t>Hoje tem live! 🖤</w:t>
+        <w:t xml:space="preserve">Manhã — </w:t>
+      </w:r>
+      <w:proofErr w:type="spellStart"/>
+      <w:r>
+        <w:t>grupo</w:t>
+      </w:r>
+      <w:proofErr w:type="spellEnd"/>
+      <w:r>
+        <w:t xml:space="preserve"> das lives</w:t>
+      </w:r>
+      <w:r>
+        <w:t xml:space="preserve"> </w:t>
+      </w:r>
+      <w:r>
+        <w:rPr>
+          <w:highlight w:val="yellow"/>
+        </w:rPr>
+        <w:t>OK</w:t>
+      </w:r>
+    </w:p>
+    <w:p>
+      <w:pPr>
+        <w:spacing w:after="0"/>
+        <w:ind w:left="227"/>
+      </w:pPr>
+      <w:r>
+        <w:t xml:space="preserve">Hoje </w:t>
+      </w:r>
+      <w:proofErr w:type="gramStart"/>
+      <w:r>
+        <w:t>tem</w:t>
+      </w:r>
+      <w:proofErr w:type="gramEnd"/>
+      <w:r>
+        <w:t xml:space="preserve"> live! 🖤</w:t>
       </w:r>
     </w:p>
     <w:p>
@@ -1014,6 +953,7 @@
         <w:ind w:left="227"/>
       </w:pPr>
       <w:r>
+        <w:lastRenderedPageBreak/>
         <w:t>— Karol</w:t>
       </w:r>
     </w:p>
@@ -1023,7 +963,24 @@
         <w:pStyle w:val="Ttulo3"/>
       </w:pPr>
       <w:r>
-        <w:t>14h45 — grupo das lives</w:t>
+        <w:t xml:space="preserve">14h45 — </w:t>
+      </w:r>
+      <w:proofErr w:type="spellStart"/>
+      <w:r>
+        <w:t>grupo</w:t>
+      </w:r>
+      <w:proofErr w:type="spellEnd"/>
+      <w:r>
+        <w:t xml:space="preserve"> das lives</w:t>
+      </w:r>
+      <w:r>
+        <w:t xml:space="preserve"> </w:t>
+      </w:r>
+      <w:r>
+        <w:rPr>
+          <w:highlight w:val="yellow"/>
+        </w:rPr>
+        <w:t>OK</w:t>
       </w:r>
     </w:p>
     <w:p>
@@ -1056,7 +1013,24 @@
         <w:pStyle w:val="Ttulo3"/>
       </w:pPr>
       <w:r>
-        <w:t>Depois da live — grupo das lives</w:t>
+        <w:t xml:space="preserve">Depois da live — </w:t>
+      </w:r>
+      <w:proofErr w:type="spellStart"/>
+      <w:r>
+        <w:t>grupo</w:t>
+      </w:r>
+      <w:proofErr w:type="spellEnd"/>
+      <w:r>
+        <w:t xml:space="preserve"> das lives</w:t>
+      </w:r>
+      <w:r>
+        <w:t xml:space="preserve"> </w:t>
+      </w:r>
+      <w:r>
+        <w:rPr>
+          <w:highlight w:val="yellow"/>
+        </w:rPr>
+        <w:t>OK</w:t>
       </w:r>
     </w:p>
     <w:p>
@@ -1273,6 +1247,7 @@
         <w:ind w:left="227"/>
       </w:pPr>
       <w:r>
+        <w:lastRenderedPageBreak/>
         <w:t>Me conta aqui: a última vez que você tentou vender algo no digital foi planejada ou no improviso?</w:t>
       </w:r>
     </w:p>

</xml_diff>